<commit_message>
Version final de aceptacion
</commit_message>
<xml_diff>
--- a/public/templates/carta-autorizacion.docx
+++ b/public/templates/carta-autorizacion.docx
@@ -2,22 +2,11 @@
 <file path=word/document.xml><?xml version="1.0" encoding="utf-8"?>
 <w:document xmlns:wpc="http://schemas.microsoft.com/office/word/2010/wordprocessingCanvas" xmlns:cx="http://schemas.microsoft.com/office/drawing/2014/chartex" xmlns:cx1="http://schemas.microsoft.com/office/drawing/2015/9/8/chartex" xmlns:cx2="http://schemas.microsoft.com/office/drawing/2015/10/21/chartex" xmlns:cx3="http://schemas.microsoft.com/office/drawing/2016/5/9/chartex" xmlns:cx4="http://schemas.microsoft.com/office/drawing/2016/5/10/chartex" xmlns:cx5="http://schemas.microsoft.com/office/drawing/2016/5/11/chartex" xmlns:cx6="http://schemas.microsoft.com/office/drawing/2016/5/12/chartex" xmlns:cx7="http://schemas.microsoft.com/office/drawing/2016/5/13/chartex" xmlns:cx8="http://schemas.microsoft.com/office/drawing/2016/5/14/chartex" xmlns:mc="http://schemas.openxmlformats.org/markup-compatibility/2006" xmlns:aink="http://schemas.microsoft.com/office/drawing/2016/ink" xmlns:am3d="http://schemas.microsoft.com/office/drawing/2017/model3d" xmlns:o="urn:schemas-microsoft-com:office:office" xmlns:r="http://schemas.openxmlformats.org/officeDocument/2006/relationships" xmlns:m="http://schemas.openxmlformats.org/officeDocument/2006/math" xmlns:v="urn:schemas-microsoft-com:vml" xmlns:wp14="http://schemas.microsoft.com/office/word/2010/wordprocessingDrawing" xmlns:wp="http://schemas.openxmlformats.org/drawingml/2006/wordprocessingDrawing" xmlns:w10="urn:schemas-microsoft-com:office:word" xmlns:w="http://schemas.openxmlformats.org/wordprocessingml/2006/main" xmlns:w14="http://schemas.microsoft.com/office/word/2010/wordml" xmlns:w15="http://schemas.microsoft.com/office/word/2012/wordml" xmlns:w16cid="http://schemas.microsoft.com/office/word/2016/wordml/cid" xmlns:w16se="http://schemas.microsoft.com/office/word/2015/wordml/symex" xmlns:wpg="http://schemas.microsoft.com/office/word/2010/wordprocessingGroup" xmlns:wpi="http://schemas.microsoft.com/office/word/2010/wordprocessingInk" xmlns:wne="http://schemas.microsoft.com/office/word/2006/wordml" xmlns:wps="http://schemas.microsoft.com/office/word/2010/wordprocessingShape" mc:Ignorable="w14 w15 w16se w16cid wp14">
   <w:body>
-    <w:p>
-      <w:pPr>
-        <w:pStyle w:val="Textoindependiente"/>
-        <w:spacing w:before="5"/>
-        <w:ind w:left="0"/>
-        <w:rPr>
-          <w:rFonts w:ascii="Times New Roman"/>
-          <w:sz w:val="2"/>
-        </w:rPr>
-      </w:pPr>
-    </w:p>
     <w:tbl>
       <w:tblPr>
         <w:tblStyle w:val="TableNormal"/>
-        <w:tblW w:w="0" w:type="auto"/>
-        <w:tblInd w:w="228" w:type="dxa"/>
+        <w:tblpPr w:leftFromText="141" w:rightFromText="141" w:vertAnchor="text" w:horzAnchor="margin" w:tblpXSpec="center" w:tblpY="-546"/>
+        <w:tblW w:w="10303" w:type="dxa"/>
         <w:tblLayout w:type="fixed"/>
         <w:tblLook w:val="01E0" w:firstRow="1" w:lastRow="1" w:firstColumn="1" w:lastColumn="1" w:noHBand="0" w:noVBand="0"/>
       </w:tblPr>
@@ -48,7 +37,6 @@
                 <w:sz w:val="14"/>
               </w:rPr>
             </w:pPr>
-            <w:bookmarkStart w:id="0" w:name="_GoBack"/>
           </w:p>
         </w:tc>
         <w:tc>
@@ -88,25 +76,31 @@
                 <w:sz w:val="15"/>
               </w:rPr>
             </w:pPr>
-            <w:bookmarkStart w:id="1" w:name="CARTA_DE_TARJETA"/>
-            <w:bookmarkEnd w:id="1"/>
-            <w:proofErr w:type="spellStart"/>
+            <w:bookmarkStart w:id="0" w:name="CARTA_DE_TARJETA"/>
+            <w:bookmarkEnd w:id="0"/>
             <w:r>
               <w:rPr>
                 <w:rFonts w:ascii="Verdana"/>
                 <w:spacing w:val="-2"/>
                 <w:sz w:val="15"/>
               </w:rPr>
-              <w:t>Denominacion</w:t>
-            </w:r>
-            <w:proofErr w:type="spellEnd"/>
+              <w:t>Denominaci</w:t>
+            </w:r>
             <w:r>
               <w:rPr>
                 <w:rFonts w:ascii="Verdana"/>
                 <w:spacing w:val="-2"/>
                 <w:sz w:val="15"/>
               </w:rPr>
-              <w:t>:</w:t>
+              <w:t>ó</w:t>
+            </w:r>
+            <w:r>
+              <w:rPr>
+                <w:rFonts w:ascii="Verdana"/>
+                <w:spacing w:val="-2"/>
+                <w:sz w:val="15"/>
+              </w:rPr>
+              <w:t>n:</w:t>
             </w:r>
           </w:p>
         </w:tc>
@@ -240,7 +234,6 @@
           </w:p>
         </w:tc>
       </w:tr>
-      <w:bookmarkEnd w:id="0"/>
       <w:tr>
         <w:trPr>
           <w:trHeight w:val="182"/>
@@ -276,7 +269,7 @@
               <mc:AlternateContent>
                 <mc:Choice Requires="wpg">
                   <w:drawing>
-                    <wp:anchor distT="0" distB="0" distL="0" distR="0" simplePos="0" relativeHeight="251659264" behindDoc="0" locked="0" layoutInCell="1" allowOverlap="1" wp14:anchorId="04618B05" wp14:editId="2D1F01E1">
+                    <wp:anchor distT="0" distB="0" distL="0" distR="0" simplePos="0" relativeHeight="251659264" behindDoc="0" locked="0" layoutInCell="1" allowOverlap="1" wp14:anchorId="4152A914" wp14:editId="1B2D3903">
                       <wp:simplePos x="0" y="0"/>
                       <wp:positionH relativeFrom="column">
                         <wp:posOffset>142494</wp:posOffset>
@@ -334,7 +327,7 @@
                 </mc:Choice>
                 <mc:Fallback>
                   <w:pict>
-                    <v:group w14:anchorId="739A403E" id="Group 54" o:spid="_x0000_s1026" style="position:absolute;margin-left:11.2pt;margin-top:-42pt;width:112.1pt;height:37.45pt;z-index:251659264;mso-wrap-distance-left:0;mso-wrap-distance-right:0" coordsize="14236,4756" o:gfxdata="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">
+                    <v:group w14:anchorId="7C35FBEA" id="Group 54" o:spid="_x0000_s1026" style="position:absolute;margin-left:11.2pt;margin-top:-42pt;width:112.1pt;height:37.45pt;z-index:251659264;mso-wrap-distance-left:0;mso-wrap-distance-right:0" coordsize="14236,4756" o:gfxdata="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">
                       <v:shapetype id="_x0000_t75" coordsize="21600,21600" o:spt="75" o:preferrelative="t" path="m@4@5l@4@11@9@11@9@5xe" filled="f" stroked="f">
                         <v:stroke joinstyle="miter"/>
                         <v:formulas>
@@ -554,16 +547,7 @@
                 <w:spacing w:val="-2"/>
                 <w:sz w:val="17"/>
               </w:rPr>
-              <w:t xml:space="preserve">Agencia: </w:t>
-            </w:r>
-            <w:proofErr w:type="gramStart"/>
-            <w:r>
-              <w:rPr>
-                <w:rFonts w:ascii="Verdana"/>
-                <w:spacing w:val="-2"/>
-                <w:sz w:val="17"/>
-              </w:rPr>
-              <w:t>Vendedor</w:t>
+              <w:t>Agencia: Vendedor</w:t>
             </w:r>
             <w:r>
               <w:rPr>
@@ -571,17 +555,8 @@
                 <w:spacing w:val="-13"/>
                 <w:sz w:val="17"/>
               </w:rPr>
-              <w:t xml:space="preserve"> </w:t>
-            </w:r>
-            <w:r>
-              <w:rPr>
-                <w:rFonts w:ascii="Verdana"/>
-                <w:spacing w:val="-2"/>
-                <w:sz w:val="17"/>
-              </w:rPr>
               <w:t>:</w:t>
             </w:r>
-            <w:proofErr w:type="gramEnd"/>
           </w:p>
         </w:tc>
         <w:tc>
@@ -684,15 +659,27 @@
                 <w:sz w:val="17"/>
               </w:rPr>
             </w:pPr>
-            <w:proofErr w:type="spellStart"/>
-            <w:r>
-              <w:rPr>
-                <w:rFonts w:ascii="Verdana"/>
-                <w:sz w:val="17"/>
-              </w:rPr>
-              <w:t>Almacen</w:t>
-            </w:r>
-            <w:proofErr w:type="spellEnd"/>
+            <w:r>
+              <w:rPr>
+                <w:rFonts w:ascii="Verdana"/>
+                <w:sz w:val="17"/>
+              </w:rPr>
+              <w:t>Almac</w:t>
+            </w:r>
+            <w:r>
+              <w:rPr>
+                <w:rFonts w:ascii="Verdana"/>
+                <w:sz w:val="17"/>
+              </w:rPr>
+              <w:t>é</w:t>
+            </w:r>
+            <w:r>
+              <w:rPr>
+                <w:rFonts w:ascii="Verdana"/>
+                <w:sz w:val="17"/>
+              </w:rPr>
+              <w:t>n</w:t>
+            </w:r>
             <w:r>
               <w:rPr>
                 <w:rFonts w:ascii="Verdana"/>
@@ -781,7 +768,6 @@
               </w:rPr>
               <w:t xml:space="preserve"> </w:t>
             </w:r>
-            <w:proofErr w:type="spellStart"/>
             <w:r>
               <w:rPr>
                 <w:rFonts w:ascii="Tahoma"/>
@@ -789,9 +775,26 @@
                 <w:spacing w:val="-6"/>
                 <w:sz w:val="17"/>
               </w:rPr>
-              <w:t>Lopez</w:t>
-            </w:r>
-            <w:proofErr w:type="spellEnd"/>
+              <w:t>L</w:t>
+            </w:r>
+            <w:r>
+              <w:rPr>
+                <w:rFonts w:ascii="Tahoma"/>
+                <w:b/>
+                <w:spacing w:val="-6"/>
+                <w:sz w:val="17"/>
+              </w:rPr>
+              <w:t>ó</w:t>
+            </w:r>
+            <w:r>
+              <w:rPr>
+                <w:rFonts w:ascii="Tahoma"/>
+                <w:b/>
+                <w:spacing w:val="-6"/>
+                <w:sz w:val="17"/>
+              </w:rPr>
+              <w:t>pez</w:t>
+            </w:r>
             <w:r>
               <w:rPr>
                 <w:rFonts w:ascii="Tahoma"/>
@@ -896,15 +899,6 @@
                 <w:sz w:val="17"/>
               </w:rPr>
             </w:pPr>
-            <w:r>
-              <w:rPr>
-                <w:rFonts w:ascii="Tahoma"/>
-                <w:b/>
-                <w:spacing w:val="-2"/>
-                <w:sz w:val="17"/>
-              </w:rPr>
-              <w:t>$</w:t>
-            </w:r>
             <w:r>
               <w:rPr>
                 <w:rFonts w:ascii="Tahoma"/>
@@ -1510,7 +1504,7 @@
                 <w:sz w:val="2"/>
               </w:rPr>
               <w:drawing>
-                <wp:inline distT="0" distB="0" distL="0" distR="0" wp14:anchorId="1997DE05" wp14:editId="722D3204">
+                <wp:inline distT="0" distB="0" distL="0" distR="0" wp14:anchorId="30F0EC47" wp14:editId="25A51E83">
                   <wp:extent cx="4139183" cy="4572"/>
                   <wp:effectExtent l="0" t="0" r="0" b="0"/>
                   <wp:docPr id="56" name="Image 56"/>
@@ -1680,7 +1674,16 @@
                 <w:position w:val="1"/>
                 <w:sz w:val="16"/>
               </w:rPr>
-              <w:tab/>
+              <w:t xml:space="preserve"> </w:t>
+            </w:r>
+            <w:bookmarkStart w:id="1" w:name="_GoBack"/>
+            <w:bookmarkEnd w:id="1"/>
+            <w:r>
+              <w:rPr>
+                <w:rFonts w:ascii="Verdana"/>
+                <w:position w:val="1"/>
+                <w:sz w:val="16"/>
+              </w:rPr>
               <w:t>{</w:t>
             </w:r>
             <w:r>
@@ -1724,10 +1727,23 @@
             <w:r>
               <w:rPr>
                 <w:rFonts w:ascii="Verdana"/>
-                <w:spacing w:val="-2"/>
-                <w:sz w:val="16"/>
-              </w:rPr>
-              <w:t>BANCOMER</w:t>
+                <w:sz w:val="16"/>
+              </w:rPr>
+              <w:t>{</w:t>
+            </w:r>
+            <w:r>
+              <w:rPr>
+                <w:rFonts w:ascii="Verdana"/>
+                <w:sz w:val="16"/>
+              </w:rPr>
+              <w:t>banco</w:t>
+            </w:r>
+            <w:r>
+              <w:rPr>
+                <w:rFonts w:ascii="Verdana"/>
+                <w:sz w:val="16"/>
+              </w:rPr>
+              <w:t>}</w:t>
             </w:r>
           </w:p>
           <w:p>
@@ -1749,7 +1765,7 @@
               <mc:AlternateContent>
                 <mc:Choice Requires="wpg">
                   <w:drawing>
-                    <wp:anchor distT="0" distB="0" distL="0" distR="0" simplePos="0" relativeHeight="251660288" behindDoc="1" locked="0" layoutInCell="1" allowOverlap="1" wp14:anchorId="4AE4B93D" wp14:editId="43A347AE">
+                    <wp:anchor distT="0" distB="0" distL="0" distR="0" simplePos="0" relativeHeight="251660288" behindDoc="1" locked="0" layoutInCell="1" allowOverlap="1" wp14:anchorId="4A903C57" wp14:editId="1A67AAA7">
                       <wp:simplePos x="0" y="0"/>
                       <wp:positionH relativeFrom="column">
                         <wp:posOffset>2073401</wp:posOffset>
@@ -1807,7 +1823,7 @@
                 </mc:Choice>
                 <mc:Fallback>
                   <w:pict>
-                    <v:group w14:anchorId="4E9FE579" id="Group 57" o:spid="_x0000_s1026" style="position:absolute;margin-left:163.25pt;margin-top:-10.1pt;width:84.6pt;height:.4pt;z-index:-251656192;mso-wrap-distance-left:0;mso-wrap-distance-right:0" coordsize="10744,50" o:gfxdata="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">
+                    <v:group w14:anchorId="7CB77DC4" id="Group 57" o:spid="_x0000_s1026" style="position:absolute;margin-left:163.25pt;margin-top:-10.1pt;width:84.6pt;height:.4pt;z-index:-251656192;mso-wrap-distance-left:0;mso-wrap-distance-right:0" coordsize="10744,50" o:gfxdata="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">
                       <v:shape id="Image 58" o:spid="_x0000_s1027" type="#_x0000_t75" style="position:absolute;width:10744;height:45;visibility:visible;mso-wrap-style:square" o:gfxdata="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">
                         <v:imagedata r:id="rId8" o:title=""/>
                       </v:shape>
@@ -1825,7 +1841,7 @@
               <mc:AlternateContent>
                 <mc:Choice Requires="wpg">
                   <w:drawing>
-                    <wp:anchor distT="0" distB="0" distL="0" distR="0" simplePos="0" relativeHeight="251661312" behindDoc="1" locked="0" layoutInCell="1" allowOverlap="1" wp14:anchorId="6A01B4FA" wp14:editId="5E88C1B2">
+                    <wp:anchor distT="0" distB="0" distL="0" distR="0" simplePos="0" relativeHeight="251661312" behindDoc="1" locked="0" layoutInCell="1" allowOverlap="1" wp14:anchorId="160A825E" wp14:editId="2C37FE61">
                       <wp:simplePos x="0" y="0"/>
                       <wp:positionH relativeFrom="column">
                         <wp:posOffset>3515105</wp:posOffset>
@@ -1883,7 +1899,7 @@
                 </mc:Choice>
                 <mc:Fallback>
                   <w:pict>
-                    <v:group w14:anchorId="256DA1AA" id="Group 59" o:spid="_x0000_s1026" style="position:absolute;margin-left:276.8pt;margin-top:-10.1pt;width:212.4pt;height:.4pt;z-index:-251655168;mso-wrap-distance-left:0;mso-wrap-distance-right:0" coordsize="26974,50" o:gfxdata="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">
+                    <v:group w14:anchorId="30BD52F4" id="Group 59" o:spid="_x0000_s1026" style="position:absolute;margin-left:276.8pt;margin-top:-10.1pt;width:212.4pt;height:.4pt;z-index:-251655168;mso-wrap-distance-left:0;mso-wrap-distance-right:0" coordsize="26974,50" o:gfxdata="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">
                       <v:shape id="Image 60" o:spid="_x0000_s1027" type="#_x0000_t75" style="position:absolute;width:26974;height:45;visibility:visible;mso-wrap-style:square" o:gfxdata="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">
                         <v:imagedata r:id="rId10" o:title=""/>
                       </v:shape>
@@ -1899,7 +1915,7 @@
                 <w:sz w:val="2"/>
               </w:rPr>
               <w:drawing>
-                <wp:inline distT="0" distB="0" distL="0" distR="0" wp14:anchorId="3F7BB290" wp14:editId="077E238B">
+                <wp:inline distT="0" distB="0" distL="0" distR="0" wp14:anchorId="7B26ABD9" wp14:editId="159B9128">
                   <wp:extent cx="1074419" cy="4572"/>
                   <wp:effectExtent l="0" t="0" r="0" b="0"/>
                   <wp:docPr id="61" name="Image 61"/>
@@ -2112,7 +2128,7 @@
               <mc:AlternateContent>
                 <mc:Choice Requires="wpg">
                   <w:drawing>
-                    <wp:anchor distT="0" distB="0" distL="0" distR="0" simplePos="0" relativeHeight="251662336" behindDoc="1" locked="0" layoutInCell="1" allowOverlap="1" wp14:anchorId="0D264E30" wp14:editId="11922DE1">
+                    <wp:anchor distT="0" distB="0" distL="0" distR="0" simplePos="0" relativeHeight="251662336" behindDoc="1" locked="0" layoutInCell="1" allowOverlap="1" wp14:anchorId="0C1C5F9C" wp14:editId="378CA05D">
                       <wp:simplePos x="0" y="0"/>
                       <wp:positionH relativeFrom="column">
                         <wp:posOffset>2442210</wp:posOffset>
@@ -2170,7 +2186,7 @@
                 </mc:Choice>
                 <mc:Fallback>
                   <w:pict>
-                    <v:group w14:anchorId="709F2AD6" id="Group 62" o:spid="_x0000_s1026" style="position:absolute;margin-left:192.3pt;margin-top:9.35pt;width:203.05pt;height:.4pt;z-index:-251654144;mso-wrap-distance-left:0;mso-wrap-distance-right:0" coordsize="25787,50" o:gfxdata="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">
+                    <v:group w14:anchorId="1C25CAA7" id="Group 62" o:spid="_x0000_s1026" style="position:absolute;margin-left:192.3pt;margin-top:9.35pt;width:203.05pt;height:.4pt;z-index:-251654144;mso-wrap-distance-left:0;mso-wrap-distance-right:0" coordsize="25787,50" o:gfxdata="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">
                       <v:shape id="Image 63" o:spid="_x0000_s1027" type="#_x0000_t75" style="position:absolute;width:25786;height:45;visibility:visible;mso-wrap-style:square" o:gfxdata="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">
                         <v:imagedata r:id="rId12" o:title=""/>
                       </v:shape>
@@ -2186,7 +2202,7 @@
                 <w:sz w:val="2"/>
               </w:rPr>
               <w:drawing>
-                <wp:inline distT="0" distB="0" distL="0" distR="0" wp14:anchorId="2FF6CB2F" wp14:editId="29DD97A0">
+                <wp:inline distT="0" distB="0" distL="0" distR="0" wp14:anchorId="28F0EE92" wp14:editId="3DFD2843">
                   <wp:extent cx="1074419" cy="4572"/>
                   <wp:effectExtent l="0" t="0" r="0" b="0"/>
                   <wp:docPr id="64" name="Image 64"/>
@@ -2236,21 +2252,26 @@
                 <w:sz w:val="16"/>
               </w:rPr>
             </w:pPr>
-            <w:proofErr w:type="spellStart"/>
-            <w:r>
-              <w:rPr>
-                <w:rFonts w:ascii="Verdana"/>
-                <w:sz w:val="16"/>
-              </w:rPr>
-              <w:t>Identificacion</w:t>
-            </w:r>
-            <w:proofErr w:type="spellEnd"/>
-            <w:r>
-              <w:rPr>
-                <w:rFonts w:ascii="Verdana"/>
-                <w:sz w:val="16"/>
-              </w:rPr>
-              <w:t xml:space="preserve"> con la que acredita el pago:</w:t>
+            <w:r>
+              <w:rPr>
+                <w:rFonts w:ascii="Verdana"/>
+                <w:sz w:val="16"/>
+              </w:rPr>
+              <w:t>Identificaci</w:t>
+            </w:r>
+            <w:r>
+              <w:rPr>
+                <w:rFonts w:ascii="Verdana"/>
+                <w:sz w:val="16"/>
+              </w:rPr>
+              <w:t>ó</w:t>
+            </w:r>
+            <w:r>
+              <w:rPr>
+                <w:rFonts w:ascii="Verdana"/>
+                <w:sz w:val="16"/>
+              </w:rPr>
+              <w:t>n con la que acredita el pago:</w:t>
             </w:r>
             <w:r>
               <w:rPr>
@@ -2291,23 +2312,21 @@
                 <w:rFonts w:ascii="Verdana"/>
                 <w:sz w:val="16"/>
               </w:rPr>
-              <w:t xml:space="preserve">Numero de </w:t>
-            </w:r>
-            <w:proofErr w:type="spellStart"/>
-            <w:r>
-              <w:rPr>
-                <w:rFonts w:ascii="Verdana"/>
-                <w:sz w:val="16"/>
-              </w:rPr>
-              <w:t>Identificacion</w:t>
-            </w:r>
-            <w:proofErr w:type="spellEnd"/>
-            <w:r>
-              <w:rPr>
-                <w:rFonts w:ascii="Verdana"/>
-                <w:sz w:val="16"/>
-              </w:rPr>
-              <w:t>.</w:t>
+              <w:t>Numero de Identificaci</w:t>
+            </w:r>
+            <w:r>
+              <w:rPr>
+                <w:rFonts w:ascii="Verdana"/>
+                <w:sz w:val="16"/>
+              </w:rPr>
+              <w:t>ó</w:t>
+            </w:r>
+            <w:r>
+              <w:rPr>
+                <w:rFonts w:ascii="Verdana"/>
+                <w:sz w:val="16"/>
+              </w:rPr>
+              <w:t>n.</w:t>
             </w:r>
             <w:r>
               <w:rPr>
@@ -2360,7 +2379,7 @@
                 <w:sz w:val="2"/>
               </w:rPr>
               <w:drawing>
-                <wp:inline distT="0" distB="0" distL="0" distR="0" wp14:anchorId="350EAEE4" wp14:editId="0F582B89">
+                <wp:inline distT="0" distB="0" distL="0" distR="0" wp14:anchorId="33FE6849" wp14:editId="41F3791C">
                   <wp:extent cx="2947415" cy="4572"/>
                   <wp:effectExtent l="0" t="0" r="0" b="0"/>
                   <wp:docPr id="65" name="Image 65"/>
@@ -2660,48 +2679,14 @@
                 <w:spacing w:val="-2"/>
                 <w:sz w:val="16"/>
               </w:rPr>
-              <w:t>(</w:t>
-            </w:r>
-            <w:proofErr w:type="spellStart"/>
-            <w:r>
-              <w:rPr>
-                <w:rFonts w:ascii="Verdana" w:hAnsi="Verdana"/>
-                <w:spacing w:val="-2"/>
-                <w:sz w:val="16"/>
-              </w:rPr>
-              <w:t>Ultimos</w:t>
-            </w:r>
-            <w:proofErr w:type="spellEnd"/>
-            <w:r>
-              <w:rPr>
-                <w:rFonts w:ascii="Verdana" w:hAnsi="Verdana"/>
-                <w:spacing w:val="-2"/>
-                <w:sz w:val="16"/>
-              </w:rPr>
-              <w:t xml:space="preserve"> </w:t>
-            </w:r>
-            <w:r>
-              <w:rPr>
-                <w:rFonts w:ascii="Verdana" w:hAnsi="Verdana"/>
-                <w:sz w:val="16"/>
-              </w:rPr>
-              <w:t xml:space="preserve">4 </w:t>
-            </w:r>
-            <w:proofErr w:type="spellStart"/>
-            <w:r>
-              <w:rPr>
-                <w:rFonts w:ascii="Verdana" w:hAnsi="Verdana"/>
-                <w:sz w:val="16"/>
-              </w:rPr>
-              <w:t>digitos</w:t>
-            </w:r>
-            <w:proofErr w:type="spellEnd"/>
-            <w:r>
-              <w:rPr>
-                <w:rFonts w:ascii="Verdana" w:hAnsi="Verdana"/>
-                <w:sz w:val="16"/>
-              </w:rPr>
-              <w:t xml:space="preserve">) </w:t>
+              <w:t xml:space="preserve">(Últimos </w:t>
+            </w:r>
+            <w:r>
+              <w:rPr>
+                <w:rFonts w:ascii="Verdana" w:hAnsi="Verdana"/>
+                <w:sz w:val="16"/>
+              </w:rPr>
+              <w:t xml:space="preserve">4 dígitos) </w:t>
             </w:r>
             <w:r>
               <w:rPr>
@@ -2716,23 +2701,7 @@
                 <w:rFonts w:ascii="Verdana" w:hAnsi="Verdana"/>
                 <w:sz w:val="16"/>
               </w:rPr>
-              <w:t xml:space="preserve">para realizar el pago del </w:t>
-            </w:r>
-            <w:proofErr w:type="spellStart"/>
-            <w:r>
-              <w:rPr>
-                <w:rFonts w:ascii="Verdana" w:hAnsi="Verdana"/>
-                <w:sz w:val="16"/>
-              </w:rPr>
-              <w:t>vehiculo</w:t>
-            </w:r>
-            <w:proofErr w:type="spellEnd"/>
-            <w:r>
-              <w:rPr>
-                <w:rFonts w:ascii="Verdana" w:hAnsi="Verdana"/>
-                <w:sz w:val="16"/>
-              </w:rPr>
-              <w:t xml:space="preserve"> </w:t>
+              <w:t xml:space="preserve">para realizar el pago del vehículo </w:t>
             </w:r>
             <w:r>
               <w:rPr>
@@ -4392,7 +4361,7 @@
               <mc:AlternateContent>
                 <mc:Choice Requires="wpg">
                   <w:drawing>
-                    <wp:inline distT="0" distB="0" distL="0" distR="0" wp14:anchorId="448ADDEB" wp14:editId="1E704E39">
+                    <wp:inline distT="0" distB="0" distL="0" distR="0" wp14:anchorId="3479F0AD" wp14:editId="4512FDF4">
                       <wp:extent cx="2368550" cy="5080"/>
                       <wp:effectExtent l="0" t="0" r="0" b="0"/>
                       <wp:docPr id="66" name="Group 66"/>
@@ -4467,7 +4436,7 @@
                 </mc:Choice>
                 <mc:Fallback>
                   <w:pict>
-                    <v:group w14:anchorId="2C00BB56" id="Group 66" o:spid="_x0000_s1026" style="width:186.5pt;height:.4pt;mso-position-horizontal-relative:char;mso-position-vertical-relative:line" coordsize="23685,50" o:gfxdata="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">
+                    <v:group w14:anchorId="056A1D54" id="Group 66" o:spid="_x0000_s1026" style="width:186.5pt;height:.4pt;mso-position-horizontal-relative:char;mso-position-vertical-relative:line" coordsize="23685,50" o:gfxdata="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">
                       <v:shape id="Graphic 67" o:spid="_x0000_s1027" style="position:absolute;width:23685;height:50;visibility:visible;mso-wrap-style:square;v-text-anchor:top" coordsize="2368550,5080" o:gfxdata="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" path="m2368296,l,,,4572r2368296,l2368296,xe" fillcolor="black" stroked="f">
                         <v:path arrowok="t"/>
                       </v:shape>
@@ -5211,6 +5180,17 @@
         </w:tc>
       </w:tr>
     </w:tbl>
+    <w:p>
+      <w:pPr>
+        <w:pStyle w:val="Textoindependiente"/>
+        <w:spacing w:before="5"/>
+        <w:ind w:left="0"/>
+        <w:rPr>
+          <w:rFonts w:ascii="Times New Roman"/>
+          <w:sz w:val="2"/>
+        </w:rPr>
+      </w:pPr>
+    </w:p>
     <w:p/>
     <w:sectPr>
       <w:pgSz w:w="12240" w:h="15840"/>

</xml_diff>